<commit_message>
declaration initiale pour revision
</commit_message>
<xml_diff>
--- a/reservation de nom.docx
+++ b/reservation de nom.docx
@@ -40,8 +40,16 @@
         <w:rPr>
           <w:lang w:val="fr-FR"/>
         </w:rPr>
-        <w:t>Développement et Analyse Digitale inc.</w:t>
-      </w:r>
+        <w:t xml:space="preserve">Développement et Analyse Digitale </w:t>
+      </w:r>
+      <w:proofErr w:type="spellStart"/>
+      <w:r>
+        <w:rPr>
+          <w:lang w:val="fr-FR"/>
+        </w:rPr>
+        <w:t>inc.</w:t>
+      </w:r>
+      <w:proofErr w:type="spellEnd"/>
     </w:p>
     <w:p>
       <w:pPr>
@@ -67,7 +75,35 @@
         <w:rPr>
           <w:lang w:val="fr-FR"/>
         </w:rPr>
-        <w:t>Digital Development &amp; Analysis Inc.</w:t>
+        <w:t xml:space="preserve">Digital </w:t>
+      </w:r>
+      <w:proofErr w:type="spellStart"/>
+      <w:r>
+        <w:rPr>
+          <w:lang w:val="fr-FR"/>
+        </w:rPr>
+        <w:t>Development</w:t>
+      </w:r>
+      <w:proofErr w:type="spellEnd"/>
+      <w:r>
+        <w:rPr>
+          <w:lang w:val="fr-FR"/>
+        </w:rPr>
+        <w:t xml:space="preserve"> &amp; </w:t>
+      </w:r>
+      <w:proofErr w:type="spellStart"/>
+      <w:r>
+        <w:rPr>
+          <w:lang w:val="fr-FR"/>
+        </w:rPr>
+        <w:t>Analysis</w:t>
+      </w:r>
+      <w:proofErr w:type="spellEnd"/>
+      <w:r>
+        <w:rPr>
+          <w:lang w:val="fr-FR"/>
+        </w:rPr>
+        <w:t xml:space="preserve"> Inc.</w:t>
       </w:r>
     </w:p>
     <w:p>
@@ -127,8 +163,16 @@
         <w:rPr>
           <w:lang w:val="fr-FR"/>
         </w:rPr>
-        <w:t>veloppement et Analyse Digitale inc.</w:t>
-      </w:r>
+        <w:t xml:space="preserve">veloppement et Analyse Digitale </w:t>
+      </w:r>
+      <w:proofErr w:type="spellStart"/>
+      <w:r>
+        <w:rPr>
+          <w:lang w:val="fr-FR"/>
+        </w:rPr>
+        <w:t>inc.</w:t>
+      </w:r>
+      <w:proofErr w:type="spellEnd"/>
       <w:r>
         <w:rPr>
           <w:rFonts w:ascii="Arial" w:hAnsi="Arial" w:cs="Arial"/>
@@ -422,8 +466,16 @@
         <w:rPr>
           <w:lang w:val="fr-FR"/>
         </w:rPr>
-        <w:t>Développement et Analyse Digitale inc.</w:t>
-      </w:r>
+        <w:t xml:space="preserve">Développement et Analyse Digitale </w:t>
+      </w:r>
+      <w:proofErr w:type="spellStart"/>
+      <w:r>
+        <w:rPr>
+          <w:lang w:val="fr-FR"/>
+        </w:rPr>
+        <w:t>inc.</w:t>
+      </w:r>
+      <w:proofErr w:type="spellEnd"/>
       <w:r>
         <w:rPr>
           <w:lang w:val="fr-FR"/>
@@ -440,8 +492,83 @@
         <w:rPr>
           <w:lang w:val="fr-FR"/>
         </w:rPr>
-        <w:t>accepté  par le registraire des entreprise du quebec.</w:t>
-      </w:r>
+        <w:t xml:space="preserve">accepté  par le registraire des entreprise du </w:t>
+      </w:r>
+      <w:proofErr w:type="spellStart"/>
+      <w:r>
+        <w:rPr>
+          <w:lang w:val="fr-FR"/>
+        </w:rPr>
+        <w:t>quebec</w:t>
+      </w:r>
+      <w:proofErr w:type="spellEnd"/>
+      <w:r>
+        <w:rPr>
+          <w:lang w:val="fr-FR"/>
+        </w:rPr>
+        <w:t>.</w:t>
+      </w:r>
+    </w:p>
+    <w:p>
+      <w:pPr>
+        <w:rPr>
+          <w:lang w:val="fr-FR"/>
+        </w:rPr>
+      </w:pPr>
+    </w:p>
+    <w:p>
+      <w:pPr>
+        <w:rPr>
+          <w:lang w:val="fr-FR"/>
+        </w:rPr>
+      </w:pPr>
+      <w:r>
+        <w:rPr>
+          <w:lang w:val="fr-FR"/>
+        </w:rPr>
+        <w:t xml:space="preserve">Le numéro de référence </w:t>
+      </w:r>
+      <w:r>
+        <w:rPr>
+          <w:lang w:val="fr-FR"/>
+        </w:rPr>
+        <w:t xml:space="preserve">du statut de constitution est </w:t>
+      </w:r>
+      <w:proofErr w:type="spellStart"/>
+      <w:r>
+        <w:rPr>
+          <w:lang w:val="fr-FR"/>
+        </w:rPr>
+        <w:t>est</w:t>
+      </w:r>
+      <w:proofErr w:type="spellEnd"/>
+      <w:r>
+        <w:rPr>
+          <w:lang w:val="fr-FR"/>
+        </w:rPr>
+        <w:t> </w:t>
+      </w:r>
+      <w:r>
+        <w:rPr>
+          <w:b/>
+          <w:bCs/>
+          <w:lang w:val="fr-FR"/>
+        </w:rPr>
+        <w:t>020200131130011</w:t>
+      </w:r>
+      <w:r>
+        <w:rPr>
+          <w:lang w:val="fr-FR"/>
+        </w:rPr>
+        <w:t>.</w:t>
+      </w:r>
+    </w:p>
+    <w:p>
+      <w:pPr>
+        <w:rPr>
+          <w:lang w:val="fr-FR"/>
+        </w:rPr>
+      </w:pPr>
     </w:p>
     <w:p>
       <w:pPr>
@@ -1078,7 +1205,6 @@
   <w:style w:type="character" w:default="1" w:styleId="DefaultParagraphFont">
     <w:name w:val="Default Paragraph Font"/>
     <w:uiPriority w:val="1"/>
-    <w:semiHidden/>
     <w:unhideWhenUsed/>
   </w:style>
   <w:style w:type="table" w:default="1" w:styleId="TableNormal">

</xml_diff>